<commit_message>
Update Projeto de Análise e Predição de Cancelamento de Reservas Hoteleiras.docx
</commit_message>
<xml_diff>
--- a/Projeto de Análise e Predição de Cancelamento de Reservas Hoteleiras.docx
+++ b/Projeto de Análise e Predição de Cancelamento de Reservas Hoteleiras.docx
@@ -66,7 +66,32 @@
     </w:p>
     <w:p>
       <w:pPr>
-        <w:rPr/>
+        <w:rPr>
+          <w:b w:val="1"/>
+          <w:bCs w:val="1"/>
+          <w:sz w:val="26"/>
+          <w:szCs w:val="26"/>
+        </w:rPr>
+      </w:pPr>
+      <w:r>
+        <w:rPr>
+          <w:b w:val="1"/>
+          <w:bCs w:val="1"/>
+          <w:sz w:val="26"/>
+          <w:szCs w:val="26"/>
+          <w:rtl w:val="0"/>
+        </w:rPr>
+        <w:t xml:space="preserve">Repositório no GitHub: https://github.com/Trilicia/Modelo-Preditivo-Hotel-Booking-Demand</w:t>
+      </w:r>
+    </w:p>
+    <w:p>
+      <w:pPr>
+        <w:rPr>
+          <w:b w:val="1"/>
+          <w:bCs w:val="1"/>
+          <w:sz w:val="26"/>
+          <w:szCs w:val="26"/>
+        </w:rPr>
       </w:pPr>
       <w:r>
         <w:pict>

</xml_diff>